<commit_message>
fix: correct folder tree in report Ch7; update README with live URLs, lowdb notes, full API ref
</commit_message>
<xml_diff>
--- a/TravelXplore_Report_Final.docx
+++ b/TravelXplore_Report_Final.docx
@@ -17138,8 +17138,7 @@
     </w:p>
     <w:p>
       <w:pPr>
-        <w:pStyle w:val="Normal"/>
-        <w:spacing w:after="200" w:before="80"/>
+        <w:spacing w:after="0" w:before="0"/>
       </w:pPr>
       <w:r>
         <w:rPr>
@@ -17148,9 +17147,13 @@
           <w:sz w:val="18"/>
           <w:szCs w:val="18"/>
         </w:rPr>
-        <w:t xml:space="preserve">travelxplore/
-</w:t>
-      </w:r>
+        <w:t xml:space="preserve">travelxplore/</w:t>
+      </w:r>
+    </w:p>
+    <w:p>
+      <w:pPr>
+        <w:spacing w:after="0" w:before="0"/>
+      </w:pPr>
       <w:r>
         <w:rPr>
           <w:rFonts w:ascii="Courier New" w:cs="Courier New" w:eastAsia="Courier New" w:hAnsi="Courier New"/>
@@ -17158,9 +17161,13 @@
           <w:sz w:val="18"/>
           <w:szCs w:val="18"/>
         </w:rPr>
-        <w:t xml:space="preserve">├── client/
-</w:t>
-      </w:r>
+        <w:t xml:space="preserve">├── client/</w:t>
+      </w:r>
+    </w:p>
+    <w:p>
+      <w:pPr>
+        <w:spacing w:after="0" w:before="0"/>
+      </w:pPr>
       <w:r>
         <w:rPr>
           <w:rFonts w:ascii="Courier New" w:cs="Courier New" w:eastAsia="Courier New" w:hAnsi="Courier New"/>
@@ -17168,9 +17175,13 @@
           <w:sz w:val="18"/>
           <w:szCs w:val="18"/>
         </w:rPr>
-        <w:t xml:space="preserve">│   ├── src/
-</w:t>
-      </w:r>
+        <w:t xml:space="preserve">│   ├── src/</w:t>
+      </w:r>
+    </w:p>
+    <w:p>
+      <w:pPr>
+        <w:spacing w:after="0" w:before="0"/>
+      </w:pPr>
       <w:r>
         <w:rPr>
           <w:rFonts w:ascii="Courier New" w:cs="Courier New" w:eastAsia="Courier New" w:hAnsi="Courier New"/>
@@ -17178,9 +17189,13 @@
           <w:sz w:val="18"/>
           <w:szCs w:val="18"/>
         </w:rPr>
-        <w:t xml:space="preserve">│   │   ├── pages/          # Landing, Auth, Host, Traveller pages
-</w:t>
-      </w:r>
+        <w:t xml:space="preserve">│   │   ├── pages/          # Landing, Auth, Host, Traveller pages</w:t>
+      </w:r>
+    </w:p>
+    <w:p>
+      <w:pPr>
+        <w:spacing w:after="0" w:before="0"/>
+      </w:pPr>
       <w:r>
         <w:rPr>
           <w:rFonts w:ascii="Courier New" w:cs="Courier New" w:eastAsia="Courier New" w:hAnsi="Courier New"/>
@@ -17188,9 +17203,13 @@
           <w:sz w:val="18"/>
           <w:szCs w:val="18"/>
         </w:rPr>
-        <w:t xml:space="preserve">│   │   ├── components/     # Navbar, OfferingCard, BookingCard
-</w:t>
-      </w:r>
+        <w:t xml:space="preserve">│   │   ├── components/     # Navbar, OfferingCard, BookingCard</w:t>
+      </w:r>
+    </w:p>
+    <w:p>
+      <w:pPr>
+        <w:spacing w:after="0" w:before="0"/>
+      </w:pPr>
       <w:r>
         <w:rPr>
           <w:rFonts w:ascii="Courier New" w:cs="Courier New" w:eastAsia="Courier New" w:hAnsi="Courier New"/>
@@ -17198,9 +17217,13 @@
           <w:sz w:val="18"/>
           <w:szCs w:val="18"/>
         </w:rPr>
-        <w:t xml:space="preserve">│   │   ├── lib/            # api.js (Axios), utils.js (helpers)
-</w:t>
-      </w:r>
+        <w:t xml:space="preserve">│   │   ├── lib/            # api.js (Axios), utils.js (helpers)</w:t>
+      </w:r>
+    </w:p>
+    <w:p>
+      <w:pPr>
+        <w:spacing w:after="0" w:before="0"/>
+      </w:pPr>
       <w:r>
         <w:rPr>
           <w:rFonts w:ascii="Courier New" w:cs="Courier New" w:eastAsia="Courier New" w:hAnsi="Courier New"/>
@@ -17208,9 +17231,13 @@
           <w:sz w:val="18"/>
           <w:szCs w:val="18"/>
         </w:rPr>
-        <w:t xml:space="preserve">│   │   └── App.jsx         # Router + RequireAuth guard
-</w:t>
-      </w:r>
+        <w:t xml:space="preserve">│   │   └── App.jsx         # Router + RequireAuth guard</w:t>
+      </w:r>
+    </w:p>
+    <w:p>
+      <w:pPr>
+        <w:spacing w:after="0" w:before="0"/>
+      </w:pPr>
       <w:r>
         <w:rPr>
           <w:rFonts w:ascii="Courier New" w:cs="Courier New" w:eastAsia="Courier New" w:hAnsi="Courier New"/>
@@ -17218,9 +17245,13 @@
           <w:sz w:val="18"/>
           <w:szCs w:val="18"/>
         </w:rPr>
-        <w:t xml:space="preserve">│   ├── index.css       # Tailwind base + custom components
-</w:t>
-      </w:r>
+        <w:t xml:space="preserve">│   ├── index.css       # Tailwind base + custom component classes</w:t>
+      </w:r>
+    </w:p>
+    <w:p>
+      <w:pPr>
+        <w:spacing w:after="0" w:before="0"/>
+      </w:pPr>
       <w:r>
         <w:rPr>
           <w:rFonts w:ascii="Courier New" w:cs="Courier New" w:eastAsia="Courier New" w:hAnsi="Courier New"/>
@@ -17228,9 +17259,13 @@
           <w:sz w:val="18"/>
           <w:szCs w:val="18"/>
         </w:rPr>
-        <w:t xml:space="preserve">│   └── vite.config.js  # Proxy: /api → localhost:5000
-</w:t>
-      </w:r>
+        <w:t xml:space="preserve">│   └── vite.config.js  # Dev proxy: /api and /uploads -&gt; :5000</w:t>
+      </w:r>
+    </w:p>
+    <w:p>
+      <w:pPr>
+        <w:spacing w:after="0" w:before="0"/>
+      </w:pPr>
       <w:r>
         <w:rPr>
           <w:rFonts w:ascii="Courier New" w:cs="Courier New" w:eastAsia="Courier New" w:hAnsi="Courier New"/>
@@ -17238,9 +17273,13 @@
           <w:sz w:val="18"/>
           <w:szCs w:val="18"/>
         </w:rPr>
-        <w:t xml:space="preserve">├── server/
-</w:t>
-      </w:r>
+        <w:t xml:space="preserve">├── server/</w:t>
+      </w:r>
+    </w:p>
+    <w:p>
+      <w:pPr>
+        <w:spacing w:after="0" w:before="0"/>
+      </w:pPr>
       <w:r>
         <w:rPr>
           <w:rFonts w:ascii="Courier New" w:cs="Courier New" w:eastAsia="Courier New" w:hAnsi="Courier New"/>
@@ -17248,9 +17287,13 @@
           <w:sz w:val="18"/>
           <w:szCs w:val="18"/>
         </w:rPr>
-        <w:t xml:space="preserve">│   └── src/
-</w:t>
-      </w:r>
+        <w:t xml:space="preserve">│   └── src/</w:t>
+      </w:r>
+    </w:p>
+    <w:p>
+      <w:pPr>
+        <w:spacing w:after="0" w:before="0"/>
+      </w:pPr>
       <w:r>
         <w:rPr>
           <w:rFonts w:ascii="Courier New" w:cs="Courier New" w:eastAsia="Courier New" w:hAnsi="Courier New"/>
@@ -17258,9 +17301,13 @@
           <w:sz w:val="18"/>
           <w:szCs w:val="18"/>
         </w:rPr>
-        <w:t xml:space="preserve">│       ├── db/schema.js    # lowdb initialization
-</w:t>
-      </w:r>
+        <w:t xml:space="preserve">│       ├── db/schema.js    # lowdb initialization</w:t>
+      </w:r>
+    </w:p>
+    <w:p>
+      <w:pPr>
+        <w:spacing w:after="0" w:before="0"/>
+      </w:pPr>
       <w:r>
         <w:rPr>
           <w:rFonts w:ascii="Courier New" w:cs="Courier New" w:eastAsia="Courier New" w:hAnsi="Courier New"/>
@@ -17268,9 +17315,13 @@
           <w:sz w:val="18"/>
           <w:szCs w:val="18"/>
         </w:rPr>
-        <w:t xml:space="preserve">│       ├── middleware/     # auth.js (JWT verify + role check)
-</w:t>
-      </w:r>
+        <w:t xml:space="preserve">│       ├── middleware/     # auth.js (JWT verify + role check)</w:t>
+      </w:r>
+    </w:p>
+    <w:p>
+      <w:pPr>
+        <w:spacing w:after="0" w:before="0"/>
+      </w:pPr>
       <w:r>
         <w:rPr>
           <w:rFonts w:ascii="Courier New" w:cs="Courier New" w:eastAsia="Courier New" w:hAnsi="Courier New"/>
@@ -17278,9 +17329,13 @@
           <w:sz w:val="18"/>
           <w:szCs w:val="18"/>
         </w:rPr>
-        <w:t xml:space="preserve">│       ├── routes/         # auth.js, offerings.js, bookings.js, upload.js
-</w:t>
-      </w:r>
+        <w:t xml:space="preserve">│       ├── routes/         # auth.js, offerings.js, bookings.js, upload.js</w:t>
+      </w:r>
+    </w:p>
+    <w:p>
+      <w:pPr>
+        <w:spacing w:after="0" w:before="0"/>
+      </w:pPr>
       <w:r>
         <w:rPr>
           <w:rFonts w:ascii="Courier New" w:cs="Courier New" w:eastAsia="Courier New" w:hAnsi="Courier New"/>
@@ -17288,9 +17343,13 @@
           <w:sz w:val="18"/>
           <w:szCs w:val="18"/>
         </w:rPr>
-        <w:t xml:space="preserve">│       └── index.js        # Express app entry point
-</w:t>
-      </w:r>
+        <w:t xml:space="preserve">│       └── index.js        # Express app entry point</w:t>
+      </w:r>
+    </w:p>
+    <w:p>
+      <w:pPr>
+        <w:spacing w:after="0" w:before="0"/>
+      </w:pPr>
       <w:r>
         <w:rPr>
           <w:rFonts w:ascii="Courier New" w:cs="Courier New" w:eastAsia="Courier New" w:hAnsi="Courier New"/>
@@ -17298,9 +17357,13 @@
           <w:sz w:val="18"/>
           <w:szCs w:val="18"/>
         </w:rPr>
-        <w:t xml:space="preserve">├── render.yaml         # Render deployment config
-</w:t>
-      </w:r>
+        <w:t xml:space="preserve">├── render.yaml         # Render deployment config</w:t>
+      </w:r>
+    </w:p>
+    <w:p>
+      <w:pPr>
+        <w:spacing w:after="0" w:before="0"/>
+      </w:pPr>
       <w:r>
         <w:rPr>
           <w:rFonts w:ascii="Courier New" w:cs="Courier New" w:eastAsia="Courier New" w:hAnsi="Courier New"/>
@@ -17308,9 +17371,13 @@
           <w:sz w:val="18"/>
           <w:szCs w:val="18"/>
         </w:rPr>
-        <w:t xml:space="preserve">└── README.md           # Full setup guide
-</w:t>
-      </w:r>
+        <w:t xml:space="preserve">└── README.md           # Full setup &amp; API reference guide</w:t>
+      </w:r>
+    </w:p>
+    <w:p>
+      <w:pPr>
+        <w:spacing w:after="200"/>
+      </w:pPr>
     </w:p>
     <w:p>
       <w:pPr>

</xml_diff>